<commit_message>
Adjust layout based on user feedback: vertical alignment and cell widths
</commit_message>
<xml_diff>
--- a/template.docx
+++ b/template.docx
@@ -87,9 +87,13 @@
         <w:gridCol w:w="828"/>
       </w:tblGrid>
       <w:tr>
+        <w:trPr>
+          <w:trHeight w:val="1050"/>
+        </w:trPr>
         <w:tc>
           <w:tcPr>
             <w:tcW w:w="8330" w:type="dxa"/>
+            <w:vAlign w:val="center"/>
           </w:tcPr>
           <w:p>
             <w:pPr>
@@ -114,6 +118,7 @@
         <w:tc>
           <w:tcPr>
             <w:tcW w:w="709" w:type="dxa"/>
+            <w:vAlign w:val="center"/>
           </w:tcPr>
           <w:p>
             <w:r>
@@ -576,6 +581,7 @@
               <w:top w:val="single" w:sz="6" w:space="0" w:color="auto"/>
               <w:bottom w:val="single" w:sz="6" w:space="0" w:color="auto"/>
             </w:tcBorders>
+            <w:vAlign w:val="bottom"/>
           </w:tcPr>
           <w:p>
             <w:r>
@@ -594,6 +600,7 @@
               <w:top w:val="single" w:sz="6" w:space="0" w:color="auto"/>
               <w:bottom w:val="single" w:sz="6" w:space="0" w:color="auto"/>
             </w:tcBorders>
+            <w:vAlign w:val="bottom"/>
           </w:tcPr>
           <w:p>
             <w:pPr>
@@ -617,6 +624,7 @@
               <w:top w:val="single" w:sz="6" w:space="0" w:color="auto"/>
               <w:bottom w:val="single" w:sz="6" w:space="0" w:color="auto"/>
             </w:tcBorders>
+            <w:vAlign w:val="bottom"/>
           </w:tcPr>
           <w:p>
             <w:r>
@@ -848,11 +856,12 @@
         </w:trPr>
         <w:tc>
           <w:tcPr>
-            <w:tcW w:w="2371" w:type="dxa"/>
+            <w:tcW w:w="2937" w:type="dxa"/>
             <w:tcBorders>
               <w:top w:val="single" w:sz="12" w:space="0" w:color="auto"/>
               <w:bottom w:val="single" w:sz="6" w:space="0" w:color="auto"/>
             </w:tcBorders>
+            <w:vAlign w:val="center"/>
           </w:tcPr>
           <w:p>
             <w:pPr>
@@ -887,6 +896,7 @@
               <w:top w:val="single" w:sz="12" w:space="0" w:color="auto"/>
               <w:bottom w:val="single" w:sz="6" w:space="0" w:color="auto"/>
             </w:tcBorders>
+            <w:vAlign w:val="center"/>
           </w:tcPr>
           <w:p>
             <w:pPr>
@@ -922,6 +932,7 @@
               <w:top w:val="single" w:sz="12" w:space="0" w:color="auto"/>
               <w:bottom w:val="single" w:sz="6" w:space="0" w:color="auto"/>
             </w:tcBorders>
+            <w:vAlign w:val="center"/>
           </w:tcPr>
           <w:p>
             <w:pPr>
@@ -956,6 +967,7 @@
               <w:top w:val="single" w:sz="12" w:space="0" w:color="auto"/>
               <w:bottom w:val="single" w:sz="6" w:space="0" w:color="auto"/>
             </w:tcBorders>
+            <w:vAlign w:val="center"/>
           </w:tcPr>
           <w:p>
             <w:pPr>
@@ -993,16 +1005,19 @@
         </w:tblPrEx>
         <w:tc>
           <w:tcPr>
-            <w:tcW w:w="2371" w:type="dxa"/>
+            <w:tcW w:w="2937" w:type="dxa"/>
             <w:tcBorders>
               <w:top w:val="nil"/>
               <w:left w:val="single" w:sz="12" w:space="0" w:color="auto"/>
               <w:bottom w:val="nil"/>
               <w:right w:val="nil"/>
             </w:tcBorders>
-            <w:vAlign w:val="bottom"/>
-          </w:tcPr>
-          <w:p>
+            <w:vAlign w:val="center"/>
+          </w:tcPr>
+          <w:p>
+            <w:pPr>
+              <w:ind w:left="113"/>
+            </w:pPr>
             <w:r>
               <w:t>{%tr for file in arquivos %}</w:t>
             </w:r>
@@ -1016,7 +1031,7 @@
               <w:left w:val="single" w:sz="6" w:space="0" w:color="auto"/>
               <w:bottom w:val="nil"/>
             </w:tcBorders>
-            <w:vAlign w:val="bottom"/>
+            <w:vAlign w:val="center"/>
           </w:tcPr>
           <w:p/>
         </w:tc>
@@ -1028,7 +1043,7 @@
               <w:left w:val="single" w:sz="6" w:space="0" w:color="auto"/>
               <w:bottom w:val="nil"/>
             </w:tcBorders>
-            <w:vAlign w:val="bottom"/>
+            <w:vAlign w:val="center"/>
           </w:tcPr>
           <w:p/>
         </w:tc>
@@ -1041,7 +1056,7 @@
               <w:bottom w:val="nil"/>
               <w:right w:val="single" w:sz="12" w:space="0" w:color="auto"/>
             </w:tcBorders>
-            <w:vAlign w:val="bottom"/>
+            <w:vAlign w:val="center"/>
           </w:tcPr>
           <w:p/>
         </w:tc>
@@ -1055,16 +1070,19 @@
         </w:tblPrEx>
         <w:tc>
           <w:tcPr>
-            <w:tcW w:w="2371" w:type="dxa"/>
+            <w:tcW w:w="2937" w:type="dxa"/>
             <w:tcBorders>
               <w:top w:val="nil"/>
               <w:left w:val="single" w:sz="12" w:space="0" w:color="auto"/>
               <w:bottom w:val="nil"/>
               <w:right w:val="nil"/>
             </w:tcBorders>
-            <w:vAlign w:val="bottom"/>
-          </w:tcPr>
-          <w:p>
+            <w:vAlign w:val="center"/>
+          </w:tcPr>
+          <w:p>
+            <w:pPr>
+              <w:ind w:left="113"/>
+            </w:pPr>
             <w:r>
               <w:rPr>
                 <w:rFonts w:ascii="Tahoma" w:hAnsi="Tahoma"/>
@@ -1082,7 +1100,7 @@
               <w:left w:val="single" w:sz="6" w:space="0" w:color="auto"/>
               <w:bottom w:val="nil"/>
             </w:tcBorders>
-            <w:vAlign w:val="bottom"/>
+            <w:vAlign w:val="center"/>
           </w:tcPr>
           <w:p>
             <w:r>
@@ -1102,7 +1120,7 @@
               <w:left w:val="single" w:sz="6" w:space="0" w:color="auto"/>
               <w:bottom w:val="nil"/>
             </w:tcBorders>
-            <w:vAlign w:val="bottom"/>
+            <w:vAlign w:val="center"/>
           </w:tcPr>
           <w:p>
             <w:r>
@@ -1123,7 +1141,7 @@
               <w:bottom w:val="nil"/>
               <w:right w:val="single" w:sz="12" w:space="0" w:color="auto"/>
             </w:tcBorders>
-            <w:vAlign w:val="bottom"/>
+            <w:vAlign w:val="center"/>
           </w:tcPr>
           <w:p>
             <w:r>
@@ -1146,16 +1164,19 @@
         </w:tblPrEx>
         <w:tc>
           <w:tcPr>
-            <w:tcW w:w="2371" w:type="dxa"/>
+            <w:tcW w:w="2937" w:type="dxa"/>
             <w:tcBorders>
               <w:top w:val="nil"/>
               <w:left w:val="single" w:sz="12" w:space="0" w:color="auto"/>
               <w:bottom w:val="nil"/>
               <w:right w:val="nil"/>
             </w:tcBorders>
-            <w:vAlign w:val="bottom"/>
-          </w:tcPr>
-          <w:p>
+            <w:vAlign w:val="center"/>
+          </w:tcPr>
+          <w:p>
+            <w:pPr>
+              <w:ind w:left="113"/>
+            </w:pPr>
             <w:r>
               <w:t>{%tr endfor %}</w:t>
             </w:r>
@@ -1169,7 +1190,7 @@
               <w:left w:val="single" w:sz="6" w:space="0" w:color="auto"/>
               <w:bottom w:val="nil"/>
             </w:tcBorders>
-            <w:vAlign w:val="bottom"/>
+            <w:vAlign w:val="center"/>
           </w:tcPr>
           <w:p/>
         </w:tc>
@@ -1181,7 +1202,7 @@
               <w:left w:val="single" w:sz="6" w:space="0" w:color="auto"/>
               <w:bottom w:val="nil"/>
             </w:tcBorders>
-            <w:vAlign w:val="bottom"/>
+            <w:vAlign w:val="center"/>
           </w:tcPr>
           <w:p/>
         </w:tc>
@@ -1194,7 +1215,7 @@
               <w:bottom w:val="nil"/>
               <w:right w:val="single" w:sz="12" w:space="0" w:color="auto"/>
             </w:tcBorders>
-            <w:vAlign w:val="bottom"/>
+            <w:vAlign w:val="center"/>
           </w:tcPr>
           <w:p/>
         </w:tc>

</xml_diff>

<commit_message>
Center texts horizontally in table 5
</commit_message>
<xml_diff>
--- a/template.docx
+++ b/template.docx
@@ -1017,6 +1017,7 @@
           <w:p>
             <w:pPr>
               <w:ind w:left="113"/>
+              <w:jc w:val="center"/>
             </w:pPr>
             <w:r>
               <w:t>{%tr for file in arquivos %}</w:t>
@@ -1033,7 +1034,11 @@
             </w:tcBorders>
             <w:vAlign w:val="center"/>
           </w:tcPr>
-          <w:p/>
+          <w:p>
+            <w:pPr>
+              <w:jc w:val="center"/>
+            </w:pPr>
+          </w:p>
         </w:tc>
         <w:tc>
           <w:tcPr>
@@ -1045,7 +1050,11 @@
             </w:tcBorders>
             <w:vAlign w:val="center"/>
           </w:tcPr>
-          <w:p/>
+          <w:p>
+            <w:pPr>
+              <w:jc w:val="center"/>
+            </w:pPr>
+          </w:p>
         </w:tc>
         <w:tc>
           <w:tcPr>
@@ -1058,7 +1067,11 @@
             </w:tcBorders>
             <w:vAlign w:val="center"/>
           </w:tcPr>
-          <w:p/>
+          <w:p>
+            <w:pPr>
+              <w:jc w:val="center"/>
+            </w:pPr>
+          </w:p>
         </w:tc>
       </w:tr>
       <w:tr>
@@ -1082,6 +1095,7 @@
           <w:p>
             <w:pPr>
               <w:ind w:left="113"/>
+              <w:jc w:val="center"/>
             </w:pPr>
             <w:r>
               <w:rPr>
@@ -1103,6 +1117,9 @@
             <w:vAlign w:val="center"/>
           </w:tcPr>
           <w:p>
+            <w:pPr>
+              <w:jc w:val="center"/>
+            </w:pPr>
             <w:r>
               <w:rPr>
                 <w:rFonts w:ascii="Tahoma" w:hAnsi="Tahoma"/>
@@ -1123,6 +1140,9 @@
             <w:vAlign w:val="center"/>
           </w:tcPr>
           <w:p>
+            <w:pPr>
+              <w:jc w:val="center"/>
+            </w:pPr>
             <w:r>
               <w:rPr>
                 <w:rFonts w:ascii="Tahoma" w:hAnsi="Tahoma"/>
@@ -1144,6 +1164,9 @@
             <w:vAlign w:val="center"/>
           </w:tcPr>
           <w:p>
+            <w:pPr>
+              <w:jc w:val="center"/>
+            </w:pPr>
             <w:r>
               <w:rPr>
                 <w:rFonts w:ascii="Tahoma" w:hAnsi="Tahoma"/>
@@ -1176,6 +1199,7 @@
           <w:p>
             <w:pPr>
               <w:ind w:left="113"/>
+              <w:jc w:val="center"/>
             </w:pPr>
             <w:r>
               <w:t>{%tr endfor %}</w:t>
@@ -1192,7 +1216,11 @@
             </w:tcBorders>
             <w:vAlign w:val="center"/>
           </w:tcPr>
-          <w:p/>
+          <w:p>
+            <w:pPr>
+              <w:jc w:val="center"/>
+            </w:pPr>
+          </w:p>
         </w:tc>
         <w:tc>
           <w:tcPr>
@@ -1204,7 +1232,11 @@
             </w:tcBorders>
             <w:vAlign w:val="center"/>
           </w:tcPr>
-          <w:p/>
+          <w:p>
+            <w:pPr>
+              <w:jc w:val="center"/>
+            </w:pPr>
+          </w:p>
         </w:tc>
         <w:tc>
           <w:tcPr>
@@ -1217,7 +1249,11 @@
             </w:tcBorders>
             <w:vAlign w:val="center"/>
           </w:tcPr>
-          <w:p/>
+          <w:p>
+            <w:pPr>
+              <w:jc w:val="center"/>
+            </w:pPr>
+          </w:p>
         </w:tc>
       </w:tr>
     </w:tbl>

</xml_diff>

<commit_message>
Align all tables to 100% page width to fix right margin alignment
</commit_message>
<xml_diff>
--- a/template.docx
+++ b/template.docx
@@ -79,7 +79,8 @@
     </w:p>
     <w:tbl>
       <w:tblPr>
-        <w:tblW w:w="0" w:type="auto"/>
+        <w:tblW w:w="5000" w:type="pct"/>
+        <w:tblLayout w:type="autofit"/>
         <w:tblLook w:val="01E0" w:firstRow="1" w:lastRow="1" w:firstColumn="1" w:lastColumn="1" w:noHBand="0" w:noVBand="0"/>
       </w:tblPr>
       <w:tblGrid>
@@ -153,9 +154,9 @@
     </w:p>
     <w:tbl>
       <w:tblPr>
-        <w:tblW w:w="4921" w:type="pct"/>
+        <w:tblW w:w="5000" w:type="pct"/>
         <w:tblInd w:w="1" w:type="dxa"/>
-        <w:tblLayout w:type="fixed"/>
+        <w:tblLayout w:type="autofit"/>
         <w:tblCellMar>
           <w:left w:w="1" w:type="dxa"/>
           <w:right w:w="1" w:type="dxa"/>
@@ -281,9 +282,9 @@
     </w:p>
     <w:tbl>
       <w:tblPr>
-        <w:tblW w:w="4921" w:type="pct"/>
+        <w:tblW w:w="5000" w:type="pct"/>
         <w:tblInd w:w="1" w:type="dxa"/>
-        <w:tblLayout w:type="fixed"/>
+        <w:tblLayout w:type="autofit"/>
         <w:tblCellMar>
           <w:left w:w="1" w:type="dxa"/>
           <w:right w:w="1" w:type="dxa"/>
@@ -410,9 +411,9 @@
     </w:p>
     <w:tbl>
       <w:tblPr>
-        <w:tblW w:w="4918" w:type="pct"/>
+        <w:tblW w:w="5000" w:type="pct"/>
         <w:tblInd w:w="7" w:type="dxa"/>
-        <w:tblLayout w:type="fixed"/>
+        <w:tblLayout w:type="autofit"/>
         <w:tblCellMar>
           <w:left w:w="1" w:type="dxa"/>
           <w:right w:w="1" w:type="dxa"/>
@@ -706,9 +707,9 @@
     </w:p>
     <w:tbl>
       <w:tblPr>
-        <w:tblW w:w="4918" w:type="pct"/>
+        <w:tblW w:w="5000" w:type="pct"/>
         <w:tblInd w:w="7" w:type="dxa"/>
-        <w:tblLayout w:type="fixed"/>
+        <w:tblLayout w:type="autofit"/>
         <w:tblCellMar>
           <w:left w:w="1" w:type="dxa"/>
           <w:right w:w="1" w:type="dxa"/>
@@ -828,7 +829,7 @@
     </w:p>
     <w:tbl>
       <w:tblPr>
-        <w:tblW w:w="4860" w:type="pct"/>
+        <w:tblW w:w="5000" w:type="pct"/>
         <w:tblInd w:w="24" w:type="dxa"/>
         <w:tblBorders>
           <w:top w:val="single" w:sz="12" w:space="0" w:color="auto"/>
@@ -837,7 +838,7 @@
           <w:right w:val="single" w:sz="12" w:space="0" w:color="auto"/>
           <w:insideV w:val="single" w:sz="6" w:space="0" w:color="auto"/>
         </w:tblBorders>
-        <w:tblLayout w:type="fixed"/>
+        <w:tblLayout w:type="autofit"/>
         <w:tblCellMar>
           <w:left w:w="21" w:type="dxa"/>
           <w:right w:w="21" w:type="dxa"/>

</xml_diff>

<commit_message>
Move REP- prefix to second cell to keep it close to number
</commit_message>
<xml_diff>
--- a/template.docx
+++ b/template.docx
@@ -112,7 +112,7 @@
                 <w:b/>
                 <w:sz w:val="32"/>
               </w:rPr>
-              <w:t>REGISTRO DE ENVIO DE PROJETOS                 REP-</w:t>
+              <w:t>REGISTRO DE ENVIO DE PROJETOS</w:t>
             </w:r>
           </w:p>
         </w:tc>
@@ -128,7 +128,7 @@
                 <w:b/>
                 <w:sz w:val="32"/>
               </w:rPr>
-              <w:t>{{ numero_rep }}</w:t>
+              <w:t>REP- {{ numero_rep }}</w:t>
             </w:r>
           </w:p>
         </w:tc>

</xml_diff>

<commit_message>
Fix table 0 and table 5 column widths and alignments to match original
</commit_message>
<xml_diff>
--- a/template.docx
+++ b/template.docx
@@ -80,7 +80,7 @@
     <w:tbl>
       <w:tblPr>
         <w:tblW w:w="5000" w:type="pct"/>
-        <w:tblLayout w:type="autofit"/>
+        <w:tblLayout w:type="fixed"/>
         <w:tblLook w:val="01E0" w:firstRow="1" w:lastRow="1" w:firstColumn="1" w:lastColumn="1" w:noHBand="0" w:noVBand="0"/>
       </w:tblPr>
       <w:tblGrid>
@@ -93,7 +93,7 @@
         </w:trPr>
         <w:tc>
           <w:tcPr>
-            <w:tcW w:w="8330" w:type="dxa"/>
+            <w:tcW w:w="7370" w:type="dxa"/>
             <w:vAlign w:val="center"/>
           </w:tcPr>
           <w:p>
@@ -118,10 +118,13 @@
         </w:tc>
         <w:tc>
           <w:tcPr>
-            <w:tcW w:w="709" w:type="dxa"/>
+            <w:tcW w:w="2268" w:type="dxa"/>
             <w:vAlign w:val="center"/>
           </w:tcPr>
           <w:p>
+            <w:pPr>
+              <w:jc w:val="right"/>
+            </w:pPr>
             <w:r>
               <w:rPr>
                 <w:rFonts w:ascii="Tahoma" w:hAnsi="Tahoma"/>
@@ -838,7 +841,7 @@
           <w:right w:val="single" w:sz="12" w:space="0" w:color="auto"/>
           <w:insideV w:val="single" w:sz="6" w:space="0" w:color="auto"/>
         </w:tblBorders>
-        <w:tblLayout w:type="autofit"/>
+        <w:tblLayout w:type="fixed"/>
         <w:tblCellMar>
           <w:left w:w="21" w:type="dxa"/>
           <w:right w:w="21" w:type="dxa"/>
@@ -857,7 +860,7 @@
         </w:trPr>
         <w:tc>
           <w:tcPr>
-            <w:tcW w:w="2937" w:type="dxa"/>
+            <w:tcW w:w="3118" w:type="dxa"/>
             <w:tcBorders>
               <w:top w:val="single" w:sz="12" w:space="0" w:color="auto"/>
               <w:bottom w:val="single" w:sz="6" w:space="0" w:color="auto"/>
@@ -892,7 +895,7 @@
         </w:tc>
         <w:tc>
           <w:tcPr>
-            <w:tcW w:w="709" w:type="dxa"/>
+            <w:tcW w:w="850" w:type="dxa"/>
             <w:tcBorders>
               <w:top w:val="single" w:sz="12" w:space="0" w:color="auto"/>
               <w:bottom w:val="single" w:sz="6" w:space="0" w:color="auto"/>
@@ -928,7 +931,7 @@
         </w:tc>
         <w:tc>
           <w:tcPr>
-            <w:tcW w:w="9921" w:type="dxa"/>
+            <w:tcW w:w="4535" w:type="dxa"/>
             <w:tcBorders>
               <w:top w:val="single" w:sz="12" w:space="0" w:color="auto"/>
               <w:bottom w:val="single" w:sz="6" w:space="0" w:color="auto"/>
@@ -1006,7 +1009,7 @@
         </w:tblPrEx>
         <w:tc>
           <w:tcPr>
-            <w:tcW w:w="2937" w:type="dxa"/>
+            <w:tcW w:w="3118" w:type="dxa"/>
             <w:tcBorders>
               <w:top w:val="nil"/>
               <w:left w:val="single" w:sz="12" w:space="0" w:color="auto"/>
@@ -1018,7 +1021,7 @@
           <w:p>
             <w:pPr>
               <w:ind w:left="113"/>
-              <w:jc w:val="center"/>
+              <w:jc w:val="left"/>
             </w:pPr>
             <w:r>
               <w:t>{%tr for file in arquivos %}</w:t>
@@ -1027,7 +1030,7 @@
         </w:tc>
         <w:tc>
           <w:tcPr>
-            <w:tcW w:w="709" w:type="dxa"/>
+            <w:tcW w:w="850" w:type="dxa"/>
             <w:tcBorders>
               <w:top w:val="nil"/>
               <w:left w:val="single" w:sz="6" w:space="0" w:color="auto"/>
@@ -1043,7 +1046,7 @@
         </w:tc>
         <w:tc>
           <w:tcPr>
-            <w:tcW w:w="9921" w:type="dxa"/>
+            <w:tcW w:w="4535" w:type="dxa"/>
             <w:tcBorders>
               <w:top w:val="nil"/>
               <w:left w:val="single" w:sz="6" w:space="0" w:color="auto"/>
@@ -1084,7 +1087,7 @@
         </w:tblPrEx>
         <w:tc>
           <w:tcPr>
-            <w:tcW w:w="2937" w:type="dxa"/>
+            <w:tcW w:w="3118" w:type="dxa"/>
             <w:tcBorders>
               <w:top w:val="nil"/>
               <w:left w:val="single" w:sz="12" w:space="0" w:color="auto"/>
@@ -1096,7 +1099,7 @@
           <w:p>
             <w:pPr>
               <w:ind w:left="113"/>
-              <w:jc w:val="center"/>
+              <w:jc w:val="left"/>
             </w:pPr>
             <w:r>
               <w:rPr>
@@ -1109,7 +1112,7 @@
         </w:tc>
         <w:tc>
           <w:tcPr>
-            <w:tcW w:w="709" w:type="dxa"/>
+            <w:tcW w:w="850" w:type="dxa"/>
             <w:tcBorders>
               <w:top w:val="nil"/>
               <w:left w:val="single" w:sz="6" w:space="0" w:color="auto"/>
@@ -1132,7 +1135,7 @@
         </w:tc>
         <w:tc>
           <w:tcPr>
-            <w:tcW w:w="9921" w:type="dxa"/>
+            <w:tcW w:w="4535" w:type="dxa"/>
             <w:tcBorders>
               <w:top w:val="nil"/>
               <w:left w:val="single" w:sz="6" w:space="0" w:color="auto"/>
@@ -1188,7 +1191,7 @@
         </w:tblPrEx>
         <w:tc>
           <w:tcPr>
-            <w:tcW w:w="2937" w:type="dxa"/>
+            <w:tcW w:w="3118" w:type="dxa"/>
             <w:tcBorders>
               <w:top w:val="nil"/>
               <w:left w:val="single" w:sz="12" w:space="0" w:color="auto"/>
@@ -1200,7 +1203,7 @@
           <w:p>
             <w:pPr>
               <w:ind w:left="113"/>
-              <w:jc w:val="center"/>
+              <w:jc w:val="left"/>
             </w:pPr>
             <w:r>
               <w:t>{%tr endfor %}</w:t>
@@ -1209,7 +1212,7 @@
         </w:tc>
         <w:tc>
           <w:tcPr>
-            <w:tcW w:w="709" w:type="dxa"/>
+            <w:tcW w:w="850" w:type="dxa"/>
             <w:tcBorders>
               <w:top w:val="nil"/>
               <w:left w:val="single" w:sz="6" w:space="0" w:color="auto"/>
@@ -1225,7 +1228,7 @@
         </w:tc>
         <w:tc>
           <w:tcPr>
-            <w:tcW w:w="9921" w:type="dxa"/>
+            <w:tcW w:w="4535" w:type="dxa"/>
             <w:tcBorders>
               <w:top w:val="nil"/>
               <w:left w:val="single" w:sz="6" w:space="0" w:color="auto"/>

</xml_diff>

<commit_message>
Remove side and inside borders from table 5 to match original design
</commit_message>
<xml_diff>
--- a/template.docx
+++ b/template.docx
@@ -836,10 +836,7 @@
         <w:tblInd w:w="24" w:type="dxa"/>
         <w:tblBorders>
           <w:top w:val="single" w:sz="12" w:space="0" w:color="auto"/>
-          <w:left w:val="single" w:sz="12" w:space="0" w:color="auto"/>
-          <w:bottom w:val="single" w:sz="6" w:space="0" w:color="auto"/>
-          <w:right w:val="single" w:sz="12" w:space="0" w:color="auto"/>
-          <w:insideV w:val="single" w:sz="6" w:space="0" w:color="auto"/>
+          <w:bottom w:val="single" w:sz="12" w:space="0" w:color="auto"/>
         </w:tblBorders>
         <w:tblLayout w:type="fixed"/>
         <w:tblCellMar>

</xml_diff>